<commit_message>
Source the halved three-year return in the roadmap document
Slide 7 of the pitch quotes an 80% three-year return for the halved
case, and that figure appeared in no other deliverable. B1.2 already
carried the halved gross benefit, the halved net benefit and the
stretched payback, then stopped one row short of the horizon the deck
leads with. The row is written as the calculation rather than the
result, matching how B1.1 presents the same measure for the base case.
</commit_message>
<xml_diff>
--- a/docs/Governance_Ethics_Roadmap.docx
+++ b/docs/Governance_Ethics_Roadmap.docx
@@ -5297,6 +5297,61 @@
                 <w:szCs w:val="19"/>
               </w:rPr>
               <w:t xml:space="preserve">negative — the first year does not recover its own cost</w:t>
+            </w:r>
+          </w:p>
+        </w:tc>
+      </w:tr>
+      <w:tr>
+        <w:trPr>
+          <w:tblHeader w:val="false"/>
+        </w:trPr>
+        <w:tc>
+          <w:tcPr>
+            <w:tcW w:type="dxa" w:w="3960"/>
+            <w:tcMar>
+              <w:top w:type="dxa" w:w="70"/>
+              <w:left w:type="dxa" w:w="110"/>
+              <w:bottom w:type="dxa" w:w="70"/>
+              <w:right w:type="dxa" w:w="110"/>
+            </w:tcMar>
+          </w:tcPr>
+          <w:p>
+            <w:pPr>
+              <w:spacing w:after="20" w:before="20"/>
+            </w:pPr>
+            <w:r>
+              <w:rPr>
+                <w:b w:val="false"/>
+                <w:bCs w:val="false"/>
+                <w:sz w:val="19"/>
+                <w:szCs w:val="19"/>
+              </w:rPr>
+              <w:t xml:space="preserve">Three-year ROI</w:t>
+            </w:r>
+          </w:p>
+        </w:tc>
+        <w:tc>
+          <w:tcPr>
+            <w:tcW w:type="dxa" w:w="5040"/>
+            <w:tcMar>
+              <w:top w:type="dxa" w:w="70"/>
+              <w:left w:type="dxa" w:w="110"/>
+              <w:bottom w:type="dxa" w:w="70"/>
+              <w:right w:type="dxa" w:w="110"/>
+            </w:tcMar>
+          </w:tcPr>
+          <w:p>
+            <w:pPr>
+              <w:spacing w:after="20" w:before="20"/>
+            </w:pPr>
+            <w:r>
+              <w:rPr>
+                <w:b w:val="false"/>
+                <w:bCs w:val="false"/>
+                <w:sz w:val="19"/>
+                <w:szCs w:val="19"/>
+              </w:rPr>
+              <w:t xml:space="preserve">(36,000 − 20,000) ÷ 20,000 = 80 %</w:t>
             </w:r>
           </w:p>
         </w:tc>

</xml_diff>